<commit_message>
Updated Admin Manual Books
</commit_message>
<xml_diff>
--- a/Gaming Cafe Billing System Admin Manual Book.docx
+++ b/Gaming Cafe Billing System Admin Manual Book.docx
@@ -2133,7 +2133,7 @@
             </w:pPr>
             <w:r>
               <w:drawing>
-                <wp:inline distT="0" distB="0" distL="0" distR="0" wp14:anchorId="278AC030" wp14:editId="5C0D79C0">
+                <wp:inline distT="0" distB="0" distL="0" distR="0" wp14:anchorId="278AC030" wp14:editId="2099FC8E">
                   <wp:extent cx="5379242" cy="1611630"/>
                   <wp:effectExtent l="0" t="0" r="0" b="7620"/>
                   <wp:docPr id="791046307" name="Picture 2"/>
@@ -2619,10 +2619,10 @@
             </w:pPr>
             <w:r>
               <w:drawing>
-                <wp:inline distT="0" distB="0" distL="0" distR="0" wp14:anchorId="5146A303" wp14:editId="3CEFF16B">
-                  <wp:extent cx="5312409" cy="2392680"/>
-                  <wp:effectExtent l="0" t="0" r="3175" b="7620"/>
-                  <wp:docPr id="771076561" name="Picture 4"/>
+                <wp:inline distT="0" distB="0" distL="0" distR="0" wp14:anchorId="53AB47C7" wp14:editId="6C9B09FE">
+                  <wp:extent cx="5362575" cy="2637916"/>
+                  <wp:effectExtent l="0" t="0" r="0" b="0"/>
+                  <wp:docPr id="1319377066" name="Picture 2"/>
                   <wp:cNvGraphicFramePr>
                     <a:graphicFrameLocks xmlns:a="http://schemas.openxmlformats.org/drawingml/2006/main" noChangeAspect="1"/>
                   </wp:cNvGraphicFramePr>
@@ -2630,12 +2630,12 @@
                     <a:graphicData uri="http://schemas.openxmlformats.org/drawingml/2006/picture">
                       <pic:pic xmlns:pic="http://schemas.openxmlformats.org/drawingml/2006/picture">
                         <pic:nvPicPr>
-                          <pic:cNvPr id="0" name="Picture 10"/>
+                          <pic:cNvPr id="0" name="Picture 6"/>
                           <pic:cNvPicPr>
                             <a:picLocks noChangeAspect="1" noChangeArrowheads="1"/>
                           </pic:cNvPicPr>
                         </pic:nvPicPr>
-                        <pic:blipFill rotWithShape="1">
+                        <pic:blipFill>
                           <a:blip r:embed="rId13" cstate="print">
                             <a:extLst>
                               <a:ext uri="{28A0092B-C50C-407E-A947-70E740481C1C}">
@@ -2643,7 +2643,7 @@
                               </a:ext>
                             </a:extLst>
                           </a:blip>
-                          <a:srcRect b="19997"/>
+                          <a:srcRect/>
                           <a:stretch>
                             <a:fillRect/>
                           </a:stretch>
@@ -2651,7 +2651,7 @@
                         <pic:spPr bwMode="auto">
                           <a:xfrm>
                             <a:off x="0" y="0"/>
-                            <a:ext cx="5323839" cy="2397828"/>
+                            <a:ext cx="5372638" cy="2642866"/>
                           </a:xfrm>
                           <a:prstGeom prst="rect">
                             <a:avLst/>
@@ -2660,11 +2660,6 @@
                           <a:ln>
                             <a:noFill/>
                           </a:ln>
-                          <a:extLst>
-                            <a:ext uri="{53640926-AAD7-44D8-BBD7-CCE9431645EC}">
-                              <a14:shadowObscured xmlns:a14="http://schemas.microsoft.com/office/drawing/2010/main"/>
-                            </a:ext>
-                          </a:extLst>
                         </pic:spPr>
                       </pic:pic>
                     </a:graphicData>
@@ -2818,7 +2813,7 @@
                 <w:rFonts w:ascii="Times New Roman" w:hAnsi="Times New Roman" w:cs="Times New Roman"/>
                 <w:lang w:val="en-ID"/>
               </w:rPr>
-              <w:t>7</w:t>
+              <w:t>23</w:t>
             </w:r>
             <w:r>
               <w:rPr>

</xml_diff>